<commit_message>
Finalize Practical 9: Update complete documentation report, verified repo link, and application screenshots for Manav Lakhani (24CS047)
</commit_message>
<xml_diff>
--- a/pract-9-awdf-24cs047.docx
+++ b/pract-9-awdf-24cs047.docx
@@ -3101,22 +3101,8 @@
             <w:pPr>
               <w:jc w:val="left"/>
             </w:pPr>
-            <w:r/>
             <w:r>
-              <w:rPr>
-                <w:rFonts w:ascii="Times New Roman" w:hAnsi="Times New Roman"/>
-                <w:b/>
-                <w:sz w:val="22"/>
-              </w:rPr>
-              <w:t xml:space="preserve">GitHub Link Repository Link: </w:t>
-            </w:r>
-            <w:r>
-              <w:rPr>
-                <w:rFonts w:ascii="Times New Roman" w:hAnsi="Times New Roman"/>
-                <w:b/>
-                <w:sz w:val="22"/>
-              </w:rPr>
-              <w:t>https://github.com/24CS047Manav/Awdf_Practica_9</w:t>
+              <w:t>GitHub Link Repository Link: https://github.com/24CS047Manav/Awdf_Practica_9</w:t>
             </w:r>
           </w:p>
         </w:tc>

</xml_diff>